<commit_message>
fix: fixing generation of contracts
</commit_message>
<xml_diff>
--- a/src/templates/default-rental-contract.docx
+++ b/src/templates/default-rental-contract.docx
@@ -5792,14 +5792,12 @@
             <w:tcW w:w="5670" w:type="dxa"/>
             <w:tcMar/>
           </w:tcPr>
-          <w:p wp14:textId="1D4D43C5">
+          <w:p wp14:textId="1ADF4020">
             <w:pPr>
               <w:pStyle w:val="TableParagraph"/>
               <w:spacing w:before="6" w:line="240" w:lineRule="auto"/>
               <w:rPr>
-                <w:b w:val="1"/>
-                <w:bCs w:val="1"/>
-                <w:color w:val="ED0000"/>
+                <w:rFonts w:ascii="Arial MT" w:hAnsi="Arial MT"/>
                 <w:sz w:val="21"/>
                 <w:szCs w:val="21"/>
               </w:rPr>
@@ -5820,7 +5818,25 @@
                 <w:sz w:val="21"/>
                 <w:szCs w:val="21"/>
               </w:rPr>
-              <w:t>packageValue</w:t>
+              <w:t>request</w:t>
+            </w:r>
+            <w:r>
+              <w:rPr>
+                <w:rFonts w:ascii="Arial MT" w:hAnsi="Arial MT"/>
+                <w:spacing w:val="18"/>
+                <w:sz w:val="21"/>
+                <w:szCs w:val="21"/>
+              </w:rPr>
+              <w:t>ed</w:t>
+            </w:r>
+            <w:r>
+              <w:rPr>
+                <w:rFonts w:ascii="Arial MT" w:hAnsi="Arial MT"/>
+                <w:spacing w:val="18"/>
+                <w:sz w:val="21"/>
+                <w:szCs w:val="21"/>
+              </w:rPr>
+              <w:t>Expense</w:t>
             </w:r>
             <w:r>
               <w:rPr>
@@ -6437,7 +6453,7 @@
             <w:tcW w:w="5670" w:type="dxa"/>
             <w:tcMar/>
           </w:tcPr>
-          <w:p wp14:textId="5A4C60FB">
+          <w:p wp14:textId="4C2A0950">
             <w:pPr>
               <w:pStyle w:val="TableParagraph"/>
               <w:suppressLineNumbers w:val="0"/>
@@ -6462,7 +6478,25 @@
                 <w:sz w:val="20"/>
                 <w:szCs w:val="20"/>
               </w:rPr>
-              <w:t>feeValue</w:t>
+              <w:t>fee</w:t>
+            </w:r>
+            <w:r>
+              <w:rPr>
+                <w:rFonts w:ascii="Arial MT"/>
+                <w:color w:val="ED0000"/>
+                <w:sz w:val="20"/>
+                <w:szCs w:val="20"/>
+              </w:rPr>
+              <w:t>s</w:t>
+            </w:r>
+            <w:r>
+              <w:rPr>
+                <w:rFonts w:ascii="Arial MT"/>
+                <w:color w:val="ED0000"/>
+                <w:sz w:val="20"/>
+                <w:szCs w:val="20"/>
+              </w:rPr>
+              <w:t>Value</w:t>
             </w:r>
             <w:r>
               <w:rPr>

</xml_diff>